<commit_message>
Add calculations functionality and update navigation links
</commit_message>
<xml_diff>
--- a/documentation/version control.docx
+++ b/documentation/version control.docx
@@ -128,10 +128,7 @@
       </w:pPr>
       <w:r>
         <w:lastRenderedPageBreak/>
-        <w:t>Version – 0.</w:t>
-      </w:r>
-      <w:r>
-        <w:t>02</w:t>
+        <w:t>Version – 0.02</w:t>
       </w:r>
     </w:p>
     <w:p/>
@@ -188,11 +185,124 @@
         <w:t xml:space="preserve">Issues with display was resolved by </w:t>
       </w:r>
       <w:r>
-        <w:t>editing css to fix overlap and massive white spaces</w:t>
+        <w:t xml:space="preserve">editing </w:t>
+      </w:r>
+      <w:proofErr w:type="spellStart"/>
+      <w:r>
+        <w:t>css</w:t>
+      </w:r>
+      <w:proofErr w:type="spellEnd"/>
+      <w:r>
+        <w:t xml:space="preserve"> to fix overlap and massive white spaces</w:t>
       </w:r>
     </w:p>
     <w:p/>
+    <w:p>
+      <w:pPr>
+        <w:pStyle w:val="Heading1"/>
+      </w:pPr>
+      <w:r>
+        <w:t>Version – 0.0</w:t>
+      </w:r>
+      <w:r>
+        <w:t>3</w:t>
+      </w:r>
+    </w:p>
     <w:p/>
+    <w:p>
+      <w:pPr>
+        <w:pStyle w:val="Heading2"/>
+      </w:pPr>
+      <w:r>
+        <w:t xml:space="preserve">What was added – </w:t>
+      </w:r>
+    </w:p>
+    <w:p>
+      <w:pPr>
+        <w:pStyle w:val="ListParagraph"/>
+        <w:numPr>
+          <w:ilvl w:val="0"/>
+          <w:numId w:val="2"/>
+        </w:numPr>
+      </w:pPr>
+      <w:r>
+        <w:t>Redid visuals across the website</w:t>
+      </w:r>
+    </w:p>
+    <w:p>
+      <w:pPr>
+        <w:pStyle w:val="ListParagraph"/>
+        <w:numPr>
+          <w:ilvl w:val="0"/>
+          <w:numId w:val="2"/>
+        </w:numPr>
+      </w:pPr>
+      <w:r>
+        <w:t>implemented the login sign up and booking systems</w:t>
+      </w:r>
+    </w:p>
+    <w:p>
+      <w:pPr>
+        <w:pStyle w:val="ListParagraph"/>
+        <w:numPr>
+          <w:ilvl w:val="0"/>
+          <w:numId w:val="2"/>
+        </w:numPr>
+      </w:pPr>
+      <w:r>
+        <w:t>did testing for booking system and login</w:t>
+      </w:r>
+    </w:p>
+    <w:p/>
+    <w:p>
+      <w:pPr>
+        <w:pStyle w:val="Heading2"/>
+      </w:pPr>
+      <w:r>
+        <w:t>Any errors that were encountered –</w:t>
+      </w:r>
+    </w:p>
+    <w:p>
+      <w:pPr>
+        <w:pStyle w:val="ListBullet"/>
+      </w:pPr>
+      <w:r>
+        <w:t xml:space="preserve"> various errors relating to the input handling(can see more in-depth notes </w:t>
+      </w:r>
+      <w:hyperlink r:id="rId5" w:history="1">
+        <w:r>
+          <w:rPr>
+            <w:rStyle w:val="Hyperlink"/>
+          </w:rPr>
+          <w:t>her</w:t>
+        </w:r>
+        <w:r>
+          <w:rPr>
+            <w:rStyle w:val="Hyperlink"/>
+          </w:rPr>
+          <w:t>e</w:t>
+        </w:r>
+      </w:hyperlink>
+      <w:r>
+        <w:t>)</w:t>
+      </w:r>
+    </w:p>
+    <w:p>
+      <w:pPr>
+        <w:pStyle w:val="Heading2"/>
+      </w:pPr>
+      <w:r>
+        <w:t xml:space="preserve">Error fixes and testing done - </w:t>
+      </w:r>
+    </w:p>
+    <w:p>
+      <w:pPr>
+        <w:pStyle w:val="ListBullet"/>
+      </w:pPr>
+      <w:r>
+        <w:t xml:space="preserve">Edited database structure, fixed length input handling issues with the registration, matched the booking inputs names to the backed etc </w:t>
+      </w:r>
+    </w:p>
     <w:sectPr>
       <w:pgSz w:w="11906" w:h="16838"/>
       <w:pgMar w:top="1440" w:right="1440" w:bottom="1440" w:left="1440" w:header="708" w:footer="708" w:gutter="0"/>
@@ -208,7 +318,7 @@
   <w:abstractNum w:abstractNumId="0" w15:restartNumberingAfterBreak="0">
     <w:nsid w:val="FFFFFF89"/>
     <w:multiLevelType w:val="singleLevel"/>
-    <w:tmpl w:val="73F2AD8E"/>
+    <w:tmpl w:val="B45E00AE"/>
     <w:lvl w:ilvl="0">
       <w:start w:val="1"/>
       <w:numFmt w:val="bullet"/>
@@ -226,8 +336,124 @@
       </w:rPr>
     </w:lvl>
   </w:abstractNum>
+  <w:abstractNum w:abstractNumId="1" w15:restartNumberingAfterBreak="0">
+    <w:nsid w:val="1709707B"/>
+    <w:multiLevelType w:val="hybridMultilevel"/>
+    <w:tmpl w:val="FD66B79C"/>
+    <w:lvl w:ilvl="0" w:tplc="08090001">
+      <w:start w:val="1"/>
+      <w:numFmt w:val="bullet"/>
+      <w:lvlText w:val=""/>
+      <w:lvlJc w:val="left"/>
+      <w:pPr>
+        <w:ind w:left="720" w:hanging="360"/>
+      </w:pPr>
+      <w:rPr>
+        <w:rFonts w:ascii="Symbol" w:hAnsi="Symbol" w:hint="default"/>
+      </w:rPr>
+    </w:lvl>
+    <w:lvl w:ilvl="1" w:tplc="08090003" w:tentative="1">
+      <w:start w:val="1"/>
+      <w:numFmt w:val="bullet"/>
+      <w:lvlText w:val="o"/>
+      <w:lvlJc w:val="left"/>
+      <w:pPr>
+        <w:ind w:left="1440" w:hanging="360"/>
+      </w:pPr>
+      <w:rPr>
+        <w:rFonts w:ascii="Courier New" w:hAnsi="Courier New" w:cs="Courier New" w:hint="default"/>
+      </w:rPr>
+    </w:lvl>
+    <w:lvl w:ilvl="2" w:tplc="08090005" w:tentative="1">
+      <w:start w:val="1"/>
+      <w:numFmt w:val="bullet"/>
+      <w:lvlText w:val=""/>
+      <w:lvlJc w:val="left"/>
+      <w:pPr>
+        <w:ind w:left="2160" w:hanging="360"/>
+      </w:pPr>
+      <w:rPr>
+        <w:rFonts w:ascii="Wingdings" w:hAnsi="Wingdings" w:hint="default"/>
+      </w:rPr>
+    </w:lvl>
+    <w:lvl w:ilvl="3" w:tplc="08090001" w:tentative="1">
+      <w:start w:val="1"/>
+      <w:numFmt w:val="bullet"/>
+      <w:lvlText w:val=""/>
+      <w:lvlJc w:val="left"/>
+      <w:pPr>
+        <w:ind w:left="2880" w:hanging="360"/>
+      </w:pPr>
+      <w:rPr>
+        <w:rFonts w:ascii="Symbol" w:hAnsi="Symbol" w:hint="default"/>
+      </w:rPr>
+    </w:lvl>
+    <w:lvl w:ilvl="4" w:tplc="08090003" w:tentative="1">
+      <w:start w:val="1"/>
+      <w:numFmt w:val="bullet"/>
+      <w:lvlText w:val="o"/>
+      <w:lvlJc w:val="left"/>
+      <w:pPr>
+        <w:ind w:left="3600" w:hanging="360"/>
+      </w:pPr>
+      <w:rPr>
+        <w:rFonts w:ascii="Courier New" w:hAnsi="Courier New" w:cs="Courier New" w:hint="default"/>
+      </w:rPr>
+    </w:lvl>
+    <w:lvl w:ilvl="5" w:tplc="08090005" w:tentative="1">
+      <w:start w:val="1"/>
+      <w:numFmt w:val="bullet"/>
+      <w:lvlText w:val=""/>
+      <w:lvlJc w:val="left"/>
+      <w:pPr>
+        <w:ind w:left="4320" w:hanging="360"/>
+      </w:pPr>
+      <w:rPr>
+        <w:rFonts w:ascii="Wingdings" w:hAnsi="Wingdings" w:hint="default"/>
+      </w:rPr>
+    </w:lvl>
+    <w:lvl w:ilvl="6" w:tplc="08090001" w:tentative="1">
+      <w:start w:val="1"/>
+      <w:numFmt w:val="bullet"/>
+      <w:lvlText w:val=""/>
+      <w:lvlJc w:val="left"/>
+      <w:pPr>
+        <w:ind w:left="5040" w:hanging="360"/>
+      </w:pPr>
+      <w:rPr>
+        <w:rFonts w:ascii="Symbol" w:hAnsi="Symbol" w:hint="default"/>
+      </w:rPr>
+    </w:lvl>
+    <w:lvl w:ilvl="7" w:tplc="08090003" w:tentative="1">
+      <w:start w:val="1"/>
+      <w:numFmt w:val="bullet"/>
+      <w:lvlText w:val="o"/>
+      <w:lvlJc w:val="left"/>
+      <w:pPr>
+        <w:ind w:left="5760" w:hanging="360"/>
+      </w:pPr>
+      <w:rPr>
+        <w:rFonts w:ascii="Courier New" w:hAnsi="Courier New" w:cs="Courier New" w:hint="default"/>
+      </w:rPr>
+    </w:lvl>
+    <w:lvl w:ilvl="8" w:tplc="08090005" w:tentative="1">
+      <w:start w:val="1"/>
+      <w:numFmt w:val="bullet"/>
+      <w:lvlText w:val=""/>
+      <w:lvlJc w:val="left"/>
+      <w:pPr>
+        <w:ind w:left="6480" w:hanging="360"/>
+      </w:pPr>
+      <w:rPr>
+        <w:rFonts w:ascii="Wingdings" w:hAnsi="Wingdings" w:hint="default"/>
+      </w:rPr>
+    </w:lvl>
+  </w:abstractNum>
   <w:num w:numId="1" w16cid:durableId="124812478">
     <w:abstractNumId w:val="0"/>
+  </w:num>
+  <w:num w:numId="2" w16cid:durableId="1705213140">
+    <w:abstractNumId w:val="1"/>
   </w:num>
 </w:numbering>
 </file>
@@ -632,7 +858,7 @@
   <w:style w:type="paragraph" w:default="1" w:styleId="Normal">
     <w:name w:val="Normal"/>
     <w:qFormat/>
-    <w:rsid w:val="00E77B72"/>
+    <w:rsid w:val="00B667F3"/>
   </w:style>
   <w:style w:type="paragraph" w:styleId="Heading1">
     <w:name w:val="heading 1"/>
@@ -1160,6 +1386,41 @@
       </w:numPr>
       <w:contextualSpacing/>
     </w:pPr>
+  </w:style>
+  <w:style w:type="character" w:styleId="Hyperlink">
+    <w:name w:val="Hyperlink"/>
+    <w:basedOn w:val="DefaultParagraphFont"/>
+    <w:uiPriority w:val="99"/>
+    <w:unhideWhenUsed/>
+    <w:rsid w:val="00B667F3"/>
+    <w:rPr>
+      <w:color w:val="467886" w:themeColor="hyperlink"/>
+      <w:u w:val="single"/>
+    </w:rPr>
+  </w:style>
+  <w:style w:type="character" w:styleId="UnresolvedMention">
+    <w:name w:val="Unresolved Mention"/>
+    <w:basedOn w:val="DefaultParagraphFont"/>
+    <w:uiPriority w:val="99"/>
+    <w:semiHidden/>
+    <w:unhideWhenUsed/>
+    <w:rsid w:val="00B667F3"/>
+    <w:rPr>
+      <w:color w:val="605E5C"/>
+      <w:shd w:val="clear" w:color="auto" w:fill="E1DFDD"/>
+    </w:rPr>
+  </w:style>
+  <w:style w:type="character" w:styleId="FollowedHyperlink">
+    <w:name w:val="FollowedHyperlink"/>
+    <w:basedOn w:val="DefaultParagraphFont"/>
+    <w:uiPriority w:val="99"/>
+    <w:semiHidden/>
+    <w:unhideWhenUsed/>
+    <w:rsid w:val="00B667F3"/>
+    <w:rPr>
+      <w:color w:val="96607D" w:themeColor="followedHyperlink"/>
+      <w:u w:val="single"/>
+    </w:rPr>
   </w:style>
 </w:styles>
 </file>

</xml_diff>